<commit_message>
Select top 100 AI papers per year
</commit_message>
<xml_diff>
--- a/paper/review_en.docx
+++ b/paper/review_en.docx
@@ -12,7 +12,7 @@
     </w:p>
     <w:p>
       <w:r>
-        <w:t>Generated: 2026-06-26 | Dataset: 100 selected papers</w:t>
+        <w:t>Generated: 2026-06-26 | Dataset: 700 selected papers</w:t>
       </w:r>
     </w:p>
     <w:p>
@@ -25,7 +25,7 @@
     </w:p>
     <w:p>
       <w:r>
-        <w:t>This draft review maps AI research from 2020 through 2026, investigating up to 1,000 candidate papers per year from free public Semantic Scholar metadata and selecting the top 100 papers overall by citation count. The resulting collection is organized by research taxonomy and enriched with deterministic key ideas, strengths, limitations, and AI-specific keyword tags.</w:t>
+        <w:t>This draft review maps AI research from 2020 through 2026, investigating up to 1,000 candidate papers per year from free public Semantic Scholar metadata and selecting the top 100 papers from each year by citation count (700 papers total). The resulting collection is organized by research taxonomy and enriched with deterministic key ideas, strengths, limitations, and AI-specific keyword tags.</w:t>
       </w:r>
     </w:p>
     <w:p>
@@ -38,7 +38,7 @@
     </w:p>
     <w:p>
       <w:r>
-        <w:t>For each year, broad AI-oriented queries were sent to Semantic Scholar Academic Graph bulk search. Records were retained when title, abstract, or venue metadata matched explicit AI relevance expressions, deduplicated by DOI, arXiv, PubMed, CorpusId, paperId, then title, and reduced to at most 1,000 candidates per year by citation count. The final 100 papers were selected across the full period by citation count, with influential citation count and metadata importance score retained as tie-breakers and audit signals.</w:t>
+        <w:t>For each year, broad AI-oriented queries were sent to Semantic Scholar Academic Graph bulk search. Records were retained when title, abstract, or venue metadata matched explicit AI relevance expressions, deduplicated by DOI, arXiv, PubMed, CorpusId, paperId, then title, and reduced to at most 1,000 candidates per year by citation count. The final collection selects the top 100 papers within each publication year by citation count, with influential citation count and metadata importance score retained as tie-breakers and audit signals.</w:t>
       </w:r>
     </w:p>
     <w:p>
@@ -54,7 +54,7 @@
         <w:pStyle w:val="ListBullet"/>
       </w:pPr>
       <w:r>
-        <w:t>The 100 selected papers account for 860,781 citations in the selected set, with the largest citation mass in 2021.</w:t>
+        <w:t>The 700 selected papers account for 1,584,599 citations in the selected set, with the largest citation mass in 2021.</w:t>
       </w:r>
     </w:p>
     <w:p>
@@ -62,7 +62,7 @@
         <w:pStyle w:val="ListBullet"/>
       </w:pPr>
       <w:r>
-        <w:t>The largest category is Foundation Models and Large Language Models (67 papers), reflecting the influence of large-scale model and representation work.</w:t>
+        <w:t>The largest category is Foundation Models and Large Language Models (417 papers), reflecting the influence of large-scale model and representation work.</w:t>
       </w:r>
     </w:p>
     <w:p>
@@ -94,7 +94,7 @@
         <w:pStyle w:val="ListBullet"/>
       </w:pPr>
       <w:r>
-        <w:t>Foundation Models and Large Language Models: 67</w:t>
+        <w:t>Foundation Models and Large Language Models: 417</w:t>
       </w:r>
     </w:p>
     <w:p>
@@ -102,7 +102,7 @@
         <w:pStyle w:val="ListBullet"/>
       </w:pPr>
       <w:r>
-        <w:t>Vision and Multimodal Learning: 17</w:t>
+        <w:t>AI for Science, Healthcare, and Robotics: 70</w:t>
       </w:r>
     </w:p>
     <w:p>
@@ -110,7 +110,7 @@
         <w:pStyle w:val="ListBullet"/>
       </w:pPr>
       <w:r>
-        <w:t>AI for Science, Healthcare, and Robotics: 8</w:t>
+        <w:t>Vision and Multimodal Learning: 67</w:t>
       </w:r>
     </w:p>
     <w:p>
@@ -118,7 +118,7 @@
         <w:pStyle w:val="ListBullet"/>
       </w:pPr>
       <w:r>
-        <w:t>Generative Models and Synthetic Media: 2</w:t>
+        <w:t>Reinforcement Learning and Agents: 33</w:t>
       </w:r>
     </w:p>
     <w:p>
@@ -126,7 +126,7 @@
         <w:pStyle w:val="ListBullet"/>
       </w:pPr>
       <w:r>
-        <w:t>Graph Learning, Recommendation, and Core Methods: 2</w:t>
+        <w:t>General AI Methods and Systems: 27</w:t>
       </w:r>
     </w:p>
     <w:p>
@@ -134,7 +134,7 @@
         <w:pStyle w:val="ListBullet"/>
       </w:pPr>
       <w:r>
-        <w:t>Reinforcement Learning and Agents: 2</w:t>
+        <w:t>Graph Learning, Recommendation, and Core Methods: 24</w:t>
       </w:r>
     </w:p>
     <w:p>
@@ -142,7 +142,7 @@
         <w:pStyle w:val="ListBullet"/>
       </w:pPr>
       <w:r>
-        <w:t>Natural Language Processing and Knowledge: 1</w:t>
+        <w:t>Generative Models and Synthetic Media: 19</w:t>
       </w:r>
     </w:p>
     <w:p>
@@ -150,7 +150,23 @@
         <w:pStyle w:val="ListBullet"/>
       </w:pPr>
       <w:r>
-        <w:t>General AI Methods and Systems: 1</w:t>
+        <w:t>Natural Language Processing and Knowledge: 16</w:t>
+      </w:r>
+    </w:p>
+    <w:p>
+      <w:pPr>
+        <w:pStyle w:val="ListBullet"/>
+      </w:pPr>
+      <w:r>
+        <w:t>Trustworthy, Explainable, and Responsible AI: 15</w:t>
+      </w:r>
+    </w:p>
+    <w:p>
+      <w:pPr>
+        <w:pStyle w:val="ListBullet"/>
+      </w:pPr>
+      <w:r>
+        <w:t>Representation, Self-Supervised, and Transfer Learning: 12</w:t>
       </w:r>
     </w:p>
     <w:p>
@@ -166,7 +182,7 @@
         <w:pStyle w:val="ListBullet"/>
       </w:pPr>
       <w:r>
-        <w:t>2020: 15 selected papers, 205,688 citations, top selected paper: An Image is Worth 16x16 Words: Transformers for Image Recognition at Scale</w:t>
+        <w:t>2020: 100 selected papers, 384,464 citations, top selected paper: An Image is Worth 16x16 Words: Transformers for Image Recognition at Scale</w:t>
       </w:r>
     </w:p>
     <w:p>
@@ -174,7 +190,7 @@
         <w:pStyle w:val="ListBullet"/>
       </w:pPr>
       <w:r>
-        <w:t>2021: 27 selected papers, 266,905 citations, top selected paper: Learning Transferable Visual Models From Natural Language Supervision</w:t>
+        <w:t>2021: 100 selected papers, 389,229 citations, top selected paper: Learning Transferable Visual Models From Natural Language Supervision</w:t>
       </w:r>
     </w:p>
     <w:p>
@@ -182,7 +198,7 @@
         <w:pStyle w:val="ListBullet"/>
       </w:pPr>
       <w:r>
-        <w:t>2022: 21 selected papers, 150,589 citations, top selected paper: Training language models to follow instructions with human feedback</w:t>
+        <w:t>2022: 100 selected papers, 274,691 citations, top selected paper: Training language models to follow instructions with human feedback</w:t>
       </w:r>
     </w:p>
     <w:p>
@@ -190,7 +206,7 @@
         <w:pStyle w:val="ListBullet"/>
       </w:pPr>
       <w:r>
-        <w:t>2023: 27 selected papers, 181,522 citations, top selected paper: LLaMA: Open and Efficient Foundation Language Models</w:t>
+        <w:t>2023: 100 selected papers, 319,073 citations, top selected paper: LLaMA: Open and Efficient Foundation Language Models</w:t>
       </w:r>
     </w:p>
     <w:p>
@@ -198,7 +214,7 @@
         <w:pStyle w:val="ListBullet"/>
       </w:pPr>
       <w:r>
-        <w:t>2024: 6 selected papers, 35,822 citations, top selected paper: The Llama 3 Herd of Models</w:t>
+        <w:t>2024: 100 selected papers, 138,468 citations, top selected paper: The Llama 3 Herd of Models</w:t>
       </w:r>
     </w:p>
     <w:p>
@@ -206,7 +222,15 @@
         <w:pStyle w:val="ListBullet"/>
       </w:pPr>
       <w:r>
-        <w:t>2025: 4 selected papers, 20,255 citations, top selected paper: Qwen3 Technical Report</w:t>
+        <w:t>2025: 100 selected papers, 72,294 citations, top selected paper: Qwen3 Technical Report</w:t>
+      </w:r>
+    </w:p>
+    <w:p>
+      <w:pPr>
+        <w:pStyle w:val="ListBullet"/>
+      </w:pPr>
+      <w:r>
+        <w:t>2026: 100 selected papers, 6,380 citations, top selected paper: Scaling Monosemanticity: Extracting Interpretable Features from Claude 3 Sonnet</w:t>
       </w:r>
     </w:p>
     <w:p>

</xml_diff>

<commit_message>
Extend AI curation to 2000-2026
</commit_message>
<xml_diff>
--- a/paper/review_en.docx
+++ b/paper/review_en.docx
@@ -7,12 +7,12 @@
         <w:pStyle w:val="Title"/>
       </w:pPr>
       <w:r>
-        <w:t>AI Research from 2020 to 2026: A Metadata-Driven Citation Map</w:t>
+        <w:t>AI Research from 2000 to 2026: A Metadata-Driven Citation Map</w:t>
       </w:r>
     </w:p>
     <w:p>
       <w:r>
-        <w:t>Generated: 2026-06-26 | Dataset: 700 selected papers</w:t>
+        <w:t>Generated: 2026-06-26 | Dataset: 2,700 selected papers</w:t>
       </w:r>
     </w:p>
     <w:p>
@@ -25,7 +25,7 @@
     </w:p>
     <w:p>
       <w:r>
-        <w:t>This draft review maps AI research from 2020 through 2026, investigating up to 1,000 candidate papers per year from free public Semantic Scholar metadata and selecting the top 100 papers from each year by citation count (700 papers total). The resulting collection is organized by research taxonomy and enriched with deterministic key ideas, strengths, limitations, and AI-specific keyword tags.</w:t>
+        <w:t>This draft review maps AI research from 2000 through 2026, investigating up to 1,000 candidate papers per year from free public Semantic Scholar metadata and selecting the top 100 papers from each year by citation count (2,700 papers total). The resulting collection is organized by research taxonomy and enriched with deterministic key ideas, strengths, limitations, and AI-specific keyword tags.</w:t>
       </w:r>
     </w:p>
     <w:p>
@@ -54,7 +54,7 @@
         <w:pStyle w:val="ListBullet"/>
       </w:pPr>
       <w:r>
-        <w:t>The 700 selected papers account for 1,584,599 citations in the selected set, with the largest citation mass in 2021.</w:t>
+        <w:t>The 2,700 selected papers account for 8,567,142 citations in the selected set, with the largest citation mass in 2015.</w:t>
       </w:r>
     </w:p>
     <w:p>
@@ -62,7 +62,7 @@
         <w:pStyle w:val="ListBullet"/>
       </w:pPr>
       <w:r>
-        <w:t>The largest category is Foundation Models and Large Language Models (417 papers), reflecting the influence of large-scale model and representation work.</w:t>
+        <w:t>The largest category is General AI Methods and Systems (688 papers), reflecting the influence of large-scale model and representation work.</w:t>
       </w:r>
     </w:p>
     <w:p>
@@ -94,7 +94,7 @@
         <w:pStyle w:val="ListBullet"/>
       </w:pPr>
       <w:r>
-        <w:t>Foundation Models and Large Language Models: 417</w:t>
+        <w:t>General AI Methods and Systems: 688</w:t>
       </w:r>
     </w:p>
     <w:p>
@@ -102,7 +102,7 @@
         <w:pStyle w:val="ListBullet"/>
       </w:pPr>
       <w:r>
-        <w:t>AI for Science, Healthcare, and Robotics: 70</w:t>
+        <w:t>Foundation Models and Large Language Models: 490</w:t>
       </w:r>
     </w:p>
     <w:p>
@@ -110,7 +110,7 @@
         <w:pStyle w:val="ListBullet"/>
       </w:pPr>
       <w:r>
-        <w:t>Vision and Multimodal Learning: 67</w:t>
+        <w:t>Vision and Multimodal Learning: 477</w:t>
       </w:r>
     </w:p>
     <w:p>
@@ -118,7 +118,7 @@
         <w:pStyle w:val="ListBullet"/>
       </w:pPr>
       <w:r>
-        <w:t>Reinforcement Learning and Agents: 33</w:t>
+        <w:t>AI for Science, Healthcare, and Robotics: 279</w:t>
       </w:r>
     </w:p>
     <w:p>
@@ -126,7 +126,7 @@
         <w:pStyle w:val="ListBullet"/>
       </w:pPr>
       <w:r>
-        <w:t>General AI Methods and Systems: 27</w:t>
+        <w:t>Graph Learning, Recommendation, and Core Methods: 195</w:t>
       </w:r>
     </w:p>
     <w:p>
@@ -134,7 +134,7 @@
         <w:pStyle w:val="ListBullet"/>
       </w:pPr>
       <w:r>
-        <w:t>Graph Learning, Recommendation, and Core Methods: 24</w:t>
+        <w:t>Reinforcement Learning and Agents: 175</w:t>
       </w:r>
     </w:p>
     <w:p>
@@ -142,7 +142,7 @@
         <w:pStyle w:val="ListBullet"/>
       </w:pPr>
       <w:r>
-        <w:t>Generative Models and Synthetic Media: 19</w:t>
+        <w:t>Natural Language Processing and Knowledge: 160</w:t>
       </w:r>
     </w:p>
     <w:p>
@@ -150,7 +150,7 @@
         <w:pStyle w:val="ListBullet"/>
       </w:pPr>
       <w:r>
-        <w:t>Natural Language Processing and Knowledge: 16</w:t>
+        <w:t>Trustworthy, Explainable, and Responsible AI: 98</w:t>
       </w:r>
     </w:p>
     <w:p>
@@ -158,7 +158,7 @@
         <w:pStyle w:val="ListBullet"/>
       </w:pPr>
       <w:r>
-        <w:t>Trustworthy, Explainable, and Responsible AI: 15</w:t>
+        <w:t>Generative Models and Synthetic Media: 83</w:t>
       </w:r>
     </w:p>
     <w:p>
@@ -166,7 +166,7 @@
         <w:pStyle w:val="ListBullet"/>
       </w:pPr>
       <w:r>
-        <w:t>Representation, Self-Supervised, and Transfer Learning: 12</w:t>
+        <w:t>Representation, Self-Supervised, and Transfer Learning: 55</w:t>
       </w:r>
     </w:p>
     <w:p>
@@ -182,7 +182,7 @@
         <w:pStyle w:val="ListBullet"/>
       </w:pPr>
       <w:r>
-        <w:t>2020: 100 selected papers, 384,464 citations, top selected paper: An Image is Worth 16x16 Words: Transformers for Image Recognition at Scale</w:t>
+        <w:t>2000: 100 selected papers, 151,750 citations, top selected paper: Data Mining: Concepts and Techniques</w:t>
       </w:r>
     </w:p>
     <w:p>
@@ -190,7 +190,7 @@
         <w:pStyle w:val="ListBullet"/>
       </w:pPr>
       <w:r>
-        <w:t>2021: 100 selected papers, 389,229 citations, top selected paper: Learning Transferable Visual Models From Natural Language Supervision</w:t>
+        <w:t>2001: 100 selected papers, 199,666 citations, top selected paper: The Elements of Statistical Learning: Data Mining, Inference, and Prediction</w:t>
       </w:r>
     </w:p>
     <w:p>
@@ -198,7 +198,7 @@
         <w:pStyle w:val="ListBullet"/>
       </w:pPr>
       <w:r>
-        <w:t>2022: 100 selected papers, 274,691 citations, top selected paper: Training language models to follow instructions with human feedback</w:t>
+        <w:t>2002: 100 selected papers, 163,015 citations, top selected paper: Data Mining - Concepts and Techniques</w:t>
       </w:r>
     </w:p>
     <w:p>
@@ -206,7 +206,7 @@
         <w:pStyle w:val="ListBullet"/>
       </w:pPr>
       <w:r>
-        <w:t>2023: 100 selected papers, 319,073 citations, top selected paper: LLaMA: Open and Efficient Foundation Language Models</w:t>
+        <w:t>2003: 100 selected papers, 124,417 citations, top selected paper: Learning with Kernels: Support Vector Machines, Regularization, Optimization, and Beyond</w:t>
       </w:r>
     </w:p>
     <w:p>
@@ -214,7 +214,7 @@
         <w:pStyle w:val="ListBullet"/>
       </w:pPr>
       <w:r>
-        <w:t>2024: 100 selected papers, 138,468 citations, top selected paper: The Llama 3 Herd of Models</w:t>
+        <w:t>2004: 100 selected papers, 142,172 citations, top selected paper: The Elements of Statistical Learning: Data Mining, Inference, and Prediction</w:t>
       </w:r>
     </w:p>
     <w:p>
@@ -222,7 +222,7 @@
         <w:pStyle w:val="ListBullet"/>
       </w:pPr>
       <w:r>
-        <w:t>2025: 100 selected papers, 72,294 citations, top selected paper: Qwen3 Technical Report</w:t>
+        <w:t>2005: 100 selected papers, 124,983 citations, top selected paper: Survey of clustering algorithms</w:t>
       </w:r>
     </w:p>
     <w:p>
@@ -230,7 +230,167 @@
         <w:pStyle w:val="ListBullet"/>
       </w:pPr>
       <w:r>
-        <w:t>2026: 100 selected papers, 6,380 citations, top selected paper: Scaling Monosemanticity: Extracting Interpretable Features from Claude 3 Sonnet</w:t>
+        <w:t>2006: 100 selected papers, 117,674 citations, top selected paper: Supporting Online Material for Reducing the Dimensionality of Data with Neural Networks</w:t>
+      </w:r>
+    </w:p>
+    <w:p>
+      <w:pPr>
+        <w:pStyle w:val="ListBullet"/>
+      </w:pPr>
+      <w:r>
+        <w:t>2007: 100 selected papers, 128,381 citations, top selected paper: Classification and Regression by randomForest</w:t>
+      </w:r>
+    </w:p>
+    <w:p>
+      <w:pPr>
+        <w:pStyle w:val="ListBullet"/>
+      </w:pPr>
+      <w:r>
+        <w:t>2008: 100 selected papers, 116,790 citations, top selected paper: LIBLINEAR: A Library for Large Linear Classification</w:t>
+      </w:r>
+    </w:p>
+    <w:p>
+      <w:pPr>
+        <w:pStyle w:val="ListBullet"/>
+      </w:pPr>
+      <w:r>
+        <w:t>2009: 100 selected papers, 247,309 citations, top selected paper: ImageNet: A large-scale hierarchical image database</w:t>
+      </w:r>
+    </w:p>
+    <w:p>
+      <w:pPr>
+        <w:pStyle w:val="ListBullet"/>
+      </w:pPr>
+      <w:r>
+        <w:t>2010: 100 selected papers, 184,831 citations, top selected paper: A Survey on Transfer Learning</w:t>
+      </w:r>
+    </w:p>
+    <w:p>
+      <w:pPr>
+        <w:pStyle w:val="ListBullet"/>
+      </w:pPr>
+      <w:r>
+        <w:t>2011: 100 selected papers, 254,295 citations, top selected paper: Scikit-learn: Machine Learning in Python</w:t>
+      </w:r>
+    </w:p>
+    <w:p>
+      <w:pPr>
+        <w:pStyle w:val="ListBullet"/>
+      </w:pPr>
+      <w:r>
+        <w:t>2012: 100 selected papers, 332,579 citations, top selected paper: ImageNet classification with deep convolutional neural networks</w:t>
+      </w:r>
+    </w:p>
+    <w:p>
+      <w:pPr>
+        <w:pStyle w:val="ListBullet"/>
+      </w:pPr>
+      <w:r>
+        <w:t>2013: 100 selected papers, 274,215 citations, top selected paper: Efficient Estimation of Word Representations in Vector Space</w:t>
+      </w:r>
+    </w:p>
+    <w:p>
+      <w:pPr>
+        <w:pStyle w:val="ListBullet"/>
+      </w:pPr>
+      <w:r>
+        <w:t>2014: 100 selected papers, 742,024 citations, top selected paper: Very Deep Convolutional Networks for Large-Scale Image Recognition</w:t>
+      </w:r>
+    </w:p>
+    <w:p>
+      <w:pPr>
+        <w:pStyle w:val="ListBullet"/>
+      </w:pPr>
+      <w:r>
+        <w:t>2015: 100 selected papers, 960,511 citations, top selected paper: Deep Residual Learning for Image Recognition</w:t>
+      </w:r>
+    </w:p>
+    <w:p>
+      <w:pPr>
+        <w:pStyle w:val="ListBullet"/>
+      </w:pPr>
+      <w:r>
+        <w:t>2016: 100 selected papers, 738,490 citations, top selected paper: XGBoost: A Scalable Tree Boosting System</w:t>
+      </w:r>
+    </w:p>
+    <w:p>
+      <w:pPr>
+        <w:pStyle w:val="ListBullet"/>
+      </w:pPr>
+      <w:r>
+        <w:t>2017: 100 selected papers, 775,257 citations, top selected paper: Attention is All you Need</w:t>
+      </w:r>
+    </w:p>
+    <w:p>
+      <w:pPr>
+        <w:pStyle w:val="ListBullet"/>
+      </w:pPr>
+      <w:r>
+        <w:t>2018: 100 selected papers, 445,723 citations, top selected paper: CBAM: Convolutional Block Attention Module</w:t>
+      </w:r>
+    </w:p>
+    <w:p>
+      <w:pPr>
+        <w:pStyle w:val="ListBullet"/>
+      </w:pPr>
+      <w:r>
+        <w:t>2019: 100 selected papers, 638,014 citations, top selected paper: BERT: Pre-training of Deep Bidirectional Transformers for Language Understanding</w:t>
+      </w:r>
+    </w:p>
+    <w:p>
+      <w:pPr>
+        <w:pStyle w:val="ListBullet"/>
+      </w:pPr>
+      <w:r>
+        <w:t>2020: 100 selected papers, 436,445 citations, top selected paper: An Image is Worth 16x16 Words: Transformers for Image Recognition at Scale</w:t>
+      </w:r>
+    </w:p>
+    <w:p>
+      <w:pPr>
+        <w:pStyle w:val="ListBullet"/>
+      </w:pPr>
+      <w:r>
+        <w:t>2021: 100 selected papers, 425,132 citations, top selected paper: Learning Transferable Visual Models From Natural Language Supervision</w:t>
+      </w:r>
+    </w:p>
+    <w:p>
+      <w:pPr>
+        <w:pStyle w:val="ListBullet"/>
+      </w:pPr>
+      <w:r>
+        <w:t>2022: 100 selected papers, 284,273 citations, top selected paper: Training language models to follow instructions with human feedback</w:t>
+      </w:r>
+    </w:p>
+    <w:p>
+      <w:pPr>
+        <w:pStyle w:val="ListBullet"/>
+      </w:pPr>
+      <w:r>
+        <w:t>2023: 100 selected papers, 334,364 citations, top selected paper: LLaMA: Open and Efficient Foundation Language Models</w:t>
+      </w:r>
+    </w:p>
+    <w:p>
+      <w:pPr>
+        <w:pStyle w:val="ListBullet"/>
+      </w:pPr>
+      <w:r>
+        <w:t>2024: 100 selected papers, 145,505 citations, top selected paper: The Llama 3 Herd of Models</w:t>
+      </w:r>
+    </w:p>
+    <w:p>
+      <w:pPr>
+        <w:pStyle w:val="ListBullet"/>
+      </w:pPr>
+      <w:r>
+        <w:t>2025: 100 selected papers, 72,745 citations, top selected paper: Qwen3 Technical Report</w:t>
+      </w:r>
+    </w:p>
+    <w:p>
+      <w:pPr>
+        <w:pStyle w:val="ListBullet"/>
+      </w:pPr>
+      <w:r>
+        <w:t>2026: 100 selected papers, 6,582 citations, top selected paper: Scaling Monosemanticity: Extracting Interpretable Features from Claude 3 Sonnet</w:t>
       </w:r>
     </w:p>
     <w:p>
@@ -246,7 +406,7 @@
         <w:pStyle w:val="ListNumber"/>
       </w:pPr>
       <w:r>
-        <w:t>2020 #1: An Image is Worth 16x16 Words: Transformers for Image Recognition at Scale (64,585 citations)</w:t>
+        <w:t>2015 #1: Deep Residual Learning for Image Recognition (231,401 citations)</w:t>
       </w:r>
     </w:p>
     <w:p>
@@ -254,7 +414,7 @@
         <w:pStyle w:val="ListNumber"/>
       </w:pPr>
       <w:r>
-        <w:t>2020 #2: Language Models are Few-Shot Learners (59,605 citations)</w:t>
+        <w:t>2017 #2: Attention is All you Need (181,426 citations)</w:t>
       </w:r>
     </w:p>
     <w:p>
@@ -262,7 +422,7 @@
         <w:pStyle w:val="ListNumber"/>
       </w:pPr>
       <w:r>
-        <w:t>2021 #3: Learning Transferable Visual Models From Natural Language Supervision (50,664 citations)</w:t>
+        <w:t>2012 #3: ImageNet classification with deep convolutional neural networks (129,676 citations)</w:t>
       </w:r>
     </w:p>
     <w:p>
@@ -270,7 +430,7 @@
         <w:pStyle w:val="ListNumber"/>
       </w:pPr>
       <w:r>
-        <w:t>2021 #4: Highly accurate protein structure prediction with AlphaFold (36,697 citations)</w:t>
+        <w:t>2019 #4: BERT: Pre-training of Deep Bidirectional Transformers for Language Understanding (116,382 citations)</w:t>
       </w:r>
     </w:p>
     <w:p>
@@ -278,7 +438,7 @@
         <w:pStyle w:val="ListNumber"/>
       </w:pPr>
       <w:r>
-        <w:t>2021 #5: Swin Transformer: Hierarchical Vision Transformer using Shifted Windows (33,057 citations)</w:t>
+        <w:t>2014 #5: Very Deep Convolutional Networks for Large-Scale Image Recognition (112,194 citations)</w:t>
       </w:r>
     </w:p>
     <w:p>
@@ -286,7 +446,7 @@
         <w:pStyle w:val="ListNumber"/>
       </w:pPr>
       <w:r>
-        <w:t>2022 #6: Training language models to follow instructions with human feedback (21,755 citations)</w:t>
+        <w:t>2011 #6: Scikit-learn: Machine Learning in Python (90,486 citations)</w:t>
       </w:r>
     </w:p>
     <w:p>
@@ -294,7 +454,7 @@
         <w:pStyle w:val="ListNumber"/>
       </w:pPr>
       <w:r>
-        <w:t>2023 #7: LLaMA: Open and Efficient Foundation Language Models (20,427 citations)</w:t>
+        <w:t>2009 #7: ImageNet: A large-scale hierarchical image database (73,960 citations)</w:t>
       </w:r>
     </w:p>
     <w:p>
@@ -302,7 +462,7 @@
         <w:pStyle w:val="ListNumber"/>
       </w:pPr>
       <w:r>
-        <w:t>2021 #8: LoRA: Low-Rank Adaptation of Large Language Models (20,108 citations)</w:t>
+        <w:t>2015 #8: Faster R-CNN: Towards Real-Time Object Detection with Region Proposal Networks (73,399 citations)</w:t>
       </w:r>
     </w:p>
     <w:p>
@@ -310,7 +470,7 @@
         <w:pStyle w:val="ListNumber"/>
       </w:pPr>
       <w:r>
-        <w:t>2022 #9: Chain of Thought Prompting Elicits Reasoning in Large Language Models (19,316 citations)</w:t>
+        <w:t>2020 #9: An Image is Worth 16x16 Words: Transformers for Image Recognition at Scale (64,585 citations)</w:t>
       </w:r>
     </w:p>
     <w:p>
@@ -318,7 +478,7 @@
         <w:pStyle w:val="ListNumber"/>
       </w:pPr>
       <w:r>
-        <w:t>2023 #10: Llama 2: Open Foundation and Fine-Tuned Chat Models (17,320 citations)</w:t>
+        <w:t>2020 #10: Language Models are Few-Shot Learners (59,605 citations)</w:t>
       </w:r>
     </w:p>
     <w:p>
@@ -326,7 +486,7 @@
         <w:pStyle w:val="ListNumber"/>
       </w:pPr>
       <w:r>
-        <w:t>2024 #11: The Llama 3 Herd of Models (16,216 citations)</w:t>
+        <w:t>2016 #11: XGBoost: A Scalable Tree Boosting System (55,903 citations)</w:t>
       </w:r>
     </w:p>
     <w:p>
@@ -334,7 +494,7 @@
         <w:pStyle w:val="ListNumber"/>
       </w:pPr>
       <w:r>
-        <w:t>2020 #12: Retrieval-Augmented Generation for Knowledge-Intensive NLP Tasks (15,004 citations)</w:t>
+        <w:t>2019 #12: PyTorch: An Imperative Style, High-Performance Deep Learning Library (52,984 citations)</w:t>
       </w:r>
     </w:p>
     <w:p>

</xml_diff>